<commit_message>
test(resume): publish one-page documents with source parity checks
</commit_message>
<xml_diff>
--- a/Rodrigo_Pinheiro_2026_EN.docx
+++ b/Rodrigo_Pinheiro_2026_EN.docx
@@ -22,7 +22,7 @@
         <w:rPr>
           <w:b/>
         </w:rPr>
-        <w:t>Junior Back-End Developer | Python · Django · FastAPI · REST APIs</w:t>
+        <w:t>Junior Web and Full-Stack Developer | Python Back-End</w:t>
       </w:r>
     </w:p>
     <w:p>
@@ -61,6 +61,38 @@
           <w:t>GitHub</w:t>
         </w:r>
       </w:hyperlink>
+      <w:r>
+        <w:rPr>
+          <w:b w:val="0"/>
+          <w:color w:val="53626D"/>
+          <w:sz w:val="16"/>
+        </w:rPr>
+        <w:t xml:space="preserve"> · </w:t>
+      </w:r>
+      <w:hyperlink r:id="rId11">
+        <w:r>
+          <w:rPr>
+            <w:color w:val="0E718B"/>
+          </w:rPr>
+          <w:t>Portfolio</w:t>
+        </w:r>
+      </w:hyperlink>
+      <w:r>
+        <w:rPr>
+          <w:b w:val="0"/>
+          <w:color w:val="53626D"/>
+          <w:sz w:val="16"/>
+        </w:rPr>
+        <w:t xml:space="preserve"> · </w:t>
+      </w:r>
+      <w:hyperlink r:id="rId12">
+        <w:r>
+          <w:rPr>
+            <w:color w:val="0E718B"/>
+          </w:rPr>
+          <w:t>LinkedIn</w:t>
+        </w:r>
+      </w:hyperlink>
     </w:p>
     <w:p>
       <w:pPr>
@@ -78,7 +110,7 @@
         <w:rPr>
           <w:b w:val="0"/>
         </w:rPr>
-        <w:t>Internet Systems graduate focused on Python back-end development. Academic and personal projects cover REST APIs, authentication and authorization, relational databases, automated testing, and React/Vite integration. Seeking an entry-level software engineering role.</w:t>
+        <w:t>Internet Systems graduate with academic and personal projects in web applications, REST APIs and responsive interfaces. Focused on Python/Django, authentication, permissions, relational persistence and automated tests, with React/Vite integration. Seeking a junior web, full-stack or Python back-end role.</w:t>
       </w:r>
     </w:p>
     <w:p>
@@ -95,9 +127,43 @@
     <w:p>
       <w:r>
         <w:rPr>
+          <w:b/>
+        </w:rPr>
+        <w:t>Back end:</w:t>
+      </w:r>
+      <w:r>
+        <w:rPr>
           <w:b w:val="0"/>
         </w:rPr>
-        <w:t>Python, Django, Django REST Framework, FastAPI, Pydantic, JWT, SQL, SQLite, PostgreSQL (CI), Git, GitHub Actions, unittest, OpenAPI, Ruff, Docker Compose; complementary React, Vite, and JavaScript skills.</w:t>
+        <w:t xml:space="preserve"> Python, Django, Django REST Framework, FastAPI, Pydantic, JWT and OpenAPI.</w:t>
+      </w:r>
+    </w:p>
+    <w:p>
+      <w:r>
+        <w:rPr>
+          <w:b/>
+        </w:rPr>
+        <w:t>Front end:</w:t>
+      </w:r>
+      <w:r>
+        <w:rPr>
+          <w:b w:val="0"/>
+        </w:rPr>
+        <w:t xml:space="preserve"> React, TypeScript, JavaScript, Vite, HTML and CSS.</w:t>
+      </w:r>
+    </w:p>
+    <w:p>
+      <w:r>
+        <w:rPr>
+          <w:b/>
+        </w:rPr>
+        <w:t>Data and tools:</w:t>
+      </w:r>
+      <w:r>
+        <w:rPr>
+          <w:b w:val="0"/>
+        </w:rPr>
+        <w:t xml:space="preserve"> SQL, SQLite, PostgreSQL configuration/CI, Git, GitHub Actions, automated testing, Playwright and Docker Compose.</w:t>
       </w:r>
     </w:p>
     <w:p>
@@ -108,7 +174,7 @@
         <w:rPr>
           <w:b w:val="0"/>
         </w:rPr>
-        <w:t>Projects</w:t>
+        <w:t>Academic and personal projects</w:t>
       </w:r>
     </w:p>
     <w:p>
@@ -121,7 +187,39 @@
         </w:rPr>
         <w:t xml:space="preserve">• </w:t>
       </w:r>
-      <w:hyperlink r:id="rId11">
+      <w:hyperlink r:id="rId13">
+        <w:r>
+          <w:rPr>
+            <w:color w:val="0E718B"/>
+            <w:b/>
+          </w:rPr>
+          <w:t>Takion Campus</w:t>
+        </w:r>
+      </w:hyperlink>
+      <w:r>
+        <w:rPr>
+          <w:b/>
+        </w:rPr>
+        <w:t>:</w:t>
+      </w:r>
+      <w:r>
+        <w:rPr>
+          <w:b w:val="0"/>
+        </w:rPr>
+        <w:t xml:space="preserve"> academic portal with a Django REST Framework API and React/Vite interface; role-based permissions, courses, grades and attendance. Local SQLite demo and front-end/back-end tests.</w:t>
+      </w:r>
+    </w:p>
+    <w:p>
+      <w:pPr>
+        <w:ind w:left="144" w:hanging="144"/>
+      </w:pPr>
+      <w:r>
+        <w:rPr>
+          <w:color w:val="0E718B"/>
+        </w:rPr>
+        <w:t xml:space="preserve">• </w:t>
+      </w:r>
+      <w:hyperlink r:id="rId14">
         <w:r>
           <w:rPr>
             <w:color w:val="0E718B"/>
@@ -140,7 +238,7 @@
         <w:rPr>
           <w:b w:val="0"/>
         </w:rPr>
-        <w:t xml:space="preserve"> Django REST Framework support-ticket API with JWT, role-based access, auditing, notifications, and CI tests.</w:t>
+        <w:t xml:space="preserve"> support-ticket API with JWT, requester/staff authorization, audit history and asynchronous notifications. OpenAPI and CI tests; local demonstration with no permanent public service.</w:t>
       </w:r>
     </w:p>
     <w:p>
@@ -153,7 +251,39 @@
         </w:rPr>
         <w:t xml:space="preserve">• </w:t>
       </w:r>
-      <w:hyperlink r:id="rId12">
+      <w:hyperlink r:id="rId15">
+        <w:r>
+          <w:rPr>
+            <w:color w:val="0E718B"/>
+            <w:b/>
+          </w:rPr>
+          <w:t>Biya — Parallel Worlds</w:t>
+        </w:r>
+      </w:hyperlink>
+      <w:r>
+        <w:rPr>
+          <w:b/>
+        </w:rPr>
+        <w:t>:</w:t>
+      </w:r>
+      <w:r>
+        <w:rPr>
+          <w:b w:val="0"/>
+        </w:rPr>
+        <w:t xml:space="preserve"> React/TypeScript interface with visual worlds, an interactive gallery, PT/EN content and reduced-motion support. Documented artwork credits and usage policy.</w:t>
+      </w:r>
+    </w:p>
+    <w:p>
+      <w:pPr>
+        <w:ind w:left="144" w:hanging="144"/>
+      </w:pPr>
+      <w:r>
+        <w:rPr>
+          <w:color w:val="0E718B"/>
+        </w:rPr>
+        <w:t xml:space="preserve">• </w:t>
+      </w:r>
+      <w:hyperlink r:id="rId16">
         <w:r>
           <w:rPr>
             <w:color w:val="0E718B"/>
@@ -172,39 +302,7 @@
         <w:rPr>
           <w:b w:val="0"/>
         </w:rPr>
-        <w:t xml:space="preserve"> FastAPI CRUD with SQLite persistence, validation and tests; modernization merged via PR #2.</w:t>
-      </w:r>
-    </w:p>
-    <w:p>
-      <w:pPr>
-        <w:ind w:left="144" w:hanging="144"/>
-      </w:pPr>
-      <w:r>
-        <w:rPr>
-          <w:color w:val="0E718B"/>
-        </w:rPr>
-        <w:t xml:space="preserve">• </w:t>
-      </w:r>
-      <w:hyperlink r:id="rId13">
-        <w:r>
-          <w:rPr>
-            <w:color w:val="0E718B"/>
-            <w:b/>
-          </w:rPr>
-          <w:t>UPA Academic Portal</w:t>
-        </w:r>
-      </w:hyperlink>
-      <w:r>
-        <w:rPr>
-          <w:b/>
-        </w:rPr>
-        <w:t>:</w:t>
-      </w:r>
-      <w:r>
-        <w:rPr>
-          <w:b w:val="0"/>
-        </w:rPr>
-        <w:t xml:space="preserve"> Django REST Framework and React/Vite application with academic modules, role-based workflows and tests.</w:t>
+        <w:t xml:space="preserve"> FastAPI CRUD with SQLite persistence, Pydantic validation, OpenAPI documentation and regression tests.</w:t>
       </w:r>
     </w:p>
     <w:p>
@@ -223,19 +321,19 @@
         <w:rPr>
           <w:b w:val="0"/>
         </w:rPr>
-        <w:t xml:space="preserve">Technology Degree in Internet Systems — Centro Universitário UNIESP. </w:t>
+        <w:t xml:space="preserve">Technology Degree in Internet Systems — Centro Universitário UNIESP. Reported completion: </w:t>
       </w:r>
       <w:r>
         <w:rPr>
           <w:b/>
         </w:rPr>
-        <w:t>Reported</w:t>
+        <w:t>2026</w:t>
       </w:r>
       <w:r>
         <w:rPr>
           <w:b w:val="0"/>
         </w:rPr>
-        <w:t xml:space="preserve"> completion: 2026.</w:t>
+        <w:t>.</w:t>
       </w:r>
     </w:p>
     <w:p>
@@ -254,11 +352,11 @@
         <w:rPr>
           <w:b w:val="0"/>
         </w:rPr>
-        <w:t>Portuguese native. English (self-reported): reading B2, listening/speaking B1, writing and interaction A2.</w:t>
+        <w:t>Portuguese native. English (self-assessed): reading B2; listening and speaking B1; writing and interaction A2.</w:t>
       </w:r>
     </w:p>
     <w:sectPr>
-      <w:pgSz w:w="12240" w:h="15840"/>
+      <w:pgSz w:w="11905" w:h="16838"/>
       <w:pgMar w:top="893" w:right="1051" w:bottom="864" w:left="1051" w:header="346" w:footer="432" w:gutter="0"/>
       <w:cols w:space="720"/>
       <w:docGrid w:linePitch="360"/>
@@ -981,16 +1079,13 @@
     <w:rsid w:val="00FC693F"/>
     <w:pPr>
       <w:keepNext/>
-      <w:pBdr>
-        <w:bottom w:val="single" w:sz="8" w:space="4" w:color="4F81BD" w:themeColor="accent1"/>
-      </w:pBdr>
       <w:spacing w:after="80" w:line="240" w:lineRule="auto" w:before="0"/>
       <w:contextualSpacing/>
     </w:pPr>
     <w:rPr>
       <w:rFonts w:asciiTheme="majorHAnsi" w:eastAsiaTheme="majorEastAsia" w:hAnsiTheme="majorHAnsi" w:cstheme="majorBidi" w:ascii="Liberation Sans" w:hAnsi="Liberation Sans"/>
       <w:b/>
-      <w:color w:val="133A66"/>
+      <w:color w:val="000000"/>
       <w:spacing w:val="5"/>
       <w:kern w:val="28"/>
       <w:sz w:val="39"/>
@@ -1469,9 +1564,6 @@
     <w:qFormat/>
     <w:rsid w:val="00FC693F"/>
     <w:pPr>
-      <w:pBdr>
-        <w:bottom w:val="single" w:sz="4" w:space="4" w:color="4F81BD" w:themeColor="accent1"/>
-      </w:pBdr>
       <w:spacing w:before="200" w:after="280"/>
       <w:ind w:left="936" w:right="936"/>
     </w:pPr>

</xml_diff>

<commit_message>
docs: rebuild bilingual one-page referral resumes with release validation
</commit_message>
<xml_diff>
--- a/Rodrigo_Pinheiro_2026_EN.docx
+++ b/Rodrigo_Pinheiro_2026_EN.docx
@@ -22,7 +22,7 @@
         <w:rPr>
           <w:b/>
         </w:rPr>
-        <w:t>Junior Back-End Developer | Python · Django · FastAPI · REST APIs</w:t>
+        <w:t>Junior Web Developer | Python · Django · React · TypeScript</w:t>
       </w:r>
     </w:p>
     <w:p>
@@ -33,7 +33,7 @@
         <w:rPr>
           <w:b w:val="0"/>
           <w:color w:val="53626D"/>
-          <w:sz w:val="16"/>
+          <w:sz w:val="20"/>
         </w:rPr>
         <w:t xml:space="preserve">Cabedelo, PB, Brazil · </w:t>
       </w:r>
@@ -45,15 +45,23 @@
           <w:t>rm20022101@gmail.com</w:t>
         </w:r>
       </w:hyperlink>
+    </w:p>
+    <w:p>
+      <w:hyperlink r:id="rId10">
+        <w:r>
+          <w:rPr>
+            <w:color w:val="0E718B"/>
+          </w:rPr>
+          <w:t>Portfolio</w:t>
+        </w:r>
+      </w:hyperlink>
       <w:r>
         <w:rPr>
           <w:b w:val="0"/>
-          <w:color w:val="53626D"/>
-          <w:sz w:val="16"/>
         </w:rPr>
         <w:t xml:space="preserve"> · </w:t>
       </w:r>
-      <w:hyperlink r:id="rId10">
+      <w:hyperlink r:id="rId11">
         <w:r>
           <w:rPr>
             <w:color w:val="0E718B"/>
@@ -61,10 +69,24 @@
           <w:t>GitHub</w:t>
         </w:r>
       </w:hyperlink>
+      <w:r>
+        <w:rPr>
+          <w:b w:val="0"/>
+        </w:rPr>
+        <w:t xml:space="preserve"> · </w:t>
+      </w:r>
+      <w:hyperlink r:id="rId12">
+        <w:r>
+          <w:rPr>
+            <w:color w:val="0E718B"/>
+          </w:rPr>
+          <w:t>LinkedIn</w:t>
+        </w:r>
+      </w:hyperlink>
     </w:p>
     <w:p>
       <w:pPr>
-        <w:pStyle w:val="Heading2"/>
+        <w:pStyle w:val="Heading1"/>
       </w:pPr>
       <w:r>
         <w:rPr>
@@ -78,12 +100,12 @@
         <w:rPr>
           <w:b w:val="0"/>
         </w:rPr>
-        <w:t>Internet Systems graduate focused on Python back-end development. Academic and personal projects cover REST APIs, authentication and authorization, relational databases, automated testing, and React/Vite integration. Seeking an entry-level software engineering role.</w:t>
+        <w:t>Developer focused on Python back ends and React interfaces. Personal and academic projects cover REST APIs, authentication, permissions, relational databases and automated testing. Seeking my first junior developer role or well-scoped web development assignments.</w:t>
       </w:r>
     </w:p>
     <w:p>
       <w:pPr>
-        <w:pStyle w:val="Heading2"/>
+        <w:pStyle w:val="Heading1"/>
       </w:pPr>
       <w:r>
         <w:rPr>
@@ -97,82 +119,18 @@
         <w:rPr>
           <w:b w:val="0"/>
         </w:rPr>
-        <w:t>Python, Django, Django REST Framework, FastAPI, Pydantic, JWT, SQL, SQLite, PostgreSQL (CI), Git, GitHub Actions, unittest, OpenAPI, Ruff, Docker Compose; complementary React, Vite, and JavaScript skills.</w:t>
+        <w:t>Python, Django REST Framework, FastAPI, SQL, SQLite, PostgreSQL, JWT and OpenAPI. React, TypeScript, JavaScript, HTML and CSS. Git, GitHub Actions, automated testing and Docker Compose.</w:t>
       </w:r>
     </w:p>
     <w:p>
       <w:pPr>
-        <w:pStyle w:val="Heading2"/>
+        <w:pStyle w:val="Heading1"/>
       </w:pPr>
       <w:r>
         <w:rPr>
           <w:b w:val="0"/>
         </w:rPr>
-        <w:t>Projects</w:t>
-      </w:r>
-    </w:p>
-    <w:p>
-      <w:pPr>
-        <w:ind w:left="144" w:hanging="144"/>
-      </w:pPr>
-      <w:r>
-        <w:rPr>
-          <w:color w:val="0E718B"/>
-        </w:rPr>
-        <w:t xml:space="preserve">• </w:t>
-      </w:r>
-      <w:hyperlink r:id="rId11">
-        <w:r>
-          <w:rPr>
-            <w:color w:val="0E718B"/>
-            <w:b/>
-          </w:rPr>
-          <w:t>Chamados API</w:t>
-        </w:r>
-      </w:hyperlink>
-      <w:r>
-        <w:rPr>
-          <w:b/>
-        </w:rPr>
-        <w:t>:</w:t>
-      </w:r>
-      <w:r>
-        <w:rPr>
-          <w:b w:val="0"/>
-        </w:rPr>
-        <w:t xml:space="preserve"> Django REST Framework support-ticket API with JWT, role-based access, auditing, notifications, and CI tests.</w:t>
-      </w:r>
-    </w:p>
-    <w:p>
-      <w:pPr>
-        <w:ind w:left="144" w:hanging="144"/>
-      </w:pPr>
-      <w:r>
-        <w:rPr>
-          <w:color w:val="0E718B"/>
-        </w:rPr>
-        <w:t xml:space="preserve">• </w:t>
-      </w:r>
-      <w:hyperlink r:id="rId12">
-        <w:r>
-          <w:rPr>
-            <w:color w:val="0E718B"/>
-            <w:b/>
-          </w:rPr>
-          <w:t>Task Manager API</w:t>
-        </w:r>
-      </w:hyperlink>
-      <w:r>
-        <w:rPr>
-          <w:b/>
-        </w:rPr>
-        <w:t>:</w:t>
-      </w:r>
-      <w:r>
-        <w:rPr>
-          <w:b w:val="0"/>
-        </w:rPr>
-        <w:t xml:space="preserve"> FastAPI CRUD with SQLite persistence, validation and tests; modernization merged via PR #2.</w:t>
+        <w:t>Selected projects</w:t>
       </w:r>
     </w:p>
     <w:p>
@@ -191,25 +149,71 @@
             <w:color w:val="0E718B"/>
             <w:b/>
           </w:rPr>
-          <w:t>UPA Academic Portal</w:t>
+          <w:t>Chamados API</w:t>
         </w:r>
       </w:hyperlink>
       <w:r>
         <w:rPr>
-          <w:b/>
+          <w:b w:val="0"/>
         </w:rPr>
-        <w:t>:</w:t>
+        <w:t xml:space="preserve"> — Django REST Framework support API with JWT, requester/staff permissions, internal comments and an audit trail. Notifications use a transactional outbox, with tests and OpenAPI documentation. Local SQLite demo; CI also uses PostgreSQL.</w:t>
       </w:r>
+    </w:p>
+    <w:p>
+      <w:pPr>
+        <w:ind w:left="144" w:hanging="144"/>
+      </w:pPr>
+      <w:r>
+        <w:rPr>
+          <w:color w:val="0E718B"/>
+        </w:rPr>
+        <w:t xml:space="preserve">• </w:t>
+      </w:r>
+      <w:hyperlink r:id="rId14">
+        <w:r>
+          <w:rPr>
+            <w:color w:val="0E718B"/>
+            <w:b/>
+          </w:rPr>
+          <w:t>Takion Campus</w:t>
+        </w:r>
+      </w:hyperlink>
       <w:r>
         <w:rPr>
           <w:b w:val="0"/>
         </w:rPr>
-        <w:t xml:space="preserve"> Django REST Framework and React/Vite application with academic modules, role-based workflows and tests.</w:t>
+        <w:t xml:space="preserve"> — Evolution of the UPA academic project, pairing React/Vite with a Django REST API. Student, teacher and administrative roles; courses, grades and attendance. Isolated local environment with fictional data and back-end/front-end tests.</w:t>
       </w:r>
     </w:p>
     <w:p>
       <w:pPr>
-        <w:pStyle w:val="Heading2"/>
+        <w:ind w:left="144" w:hanging="144"/>
+      </w:pPr>
+      <w:r>
+        <w:rPr>
+          <w:color w:val="0E718B"/>
+        </w:rPr>
+        <w:t xml:space="preserve">• </w:t>
+      </w:r>
+      <w:hyperlink r:id="rId15">
+        <w:r>
+          <w:rPr>
+            <w:color w:val="0E718B"/>
+            <w:b/>
+          </w:rPr>
+          <w:t>Biya — Parallel Worlds</w:t>
+        </w:r>
+      </w:hyperlink>
+      <w:r>
+        <w:rPr>
+          <w:b w:val="0"/>
+        </w:rPr>
+        <w:t xml:space="preserve"> — React and TypeScript website with PT/EN content, a gallery, responsive navigation and visual modes. Microinteractions and reduced-motion support, respecting artwork credits and usage policies.</w:t>
+      </w:r>
+    </w:p>
+    <w:p>
+      <w:pPr>
+        <w:pStyle w:val="Heading1"/>
       </w:pPr>
       <w:r>
         <w:rPr>
@@ -223,24 +227,12 @@
         <w:rPr>
           <w:b w:val="0"/>
         </w:rPr>
-        <w:t xml:space="preserve">Technology Degree in Internet Systems — Centro Universitário UNIESP. </w:t>
-      </w:r>
-      <w:r>
-        <w:rPr>
-          <w:b/>
-        </w:rPr>
-        <w:t>Reported</w:t>
-      </w:r>
-      <w:r>
-        <w:rPr>
-          <w:b w:val="0"/>
-        </w:rPr>
-        <w:t xml:space="preserve"> completion: 2026.</w:t>
+        <w:t>Internet Systems Technology — Centro Universitário UNIESP, Cabedelo, PB, Brazil. 2026.</w:t>
       </w:r>
     </w:p>
     <w:p>
       <w:pPr>
-        <w:pStyle w:val="Heading2"/>
+        <w:pStyle w:val="Heading1"/>
       </w:pPr>
       <w:r>
         <w:rPr>
@@ -254,7 +246,7 @@
         <w:rPr>
           <w:b w:val="0"/>
         </w:rPr>
-        <w:t>Portuguese native. English (self-reported): reading B2, listening/speaking B1, writing and interaction A2.</w:t>
+        <w:t>Native Portuguese. Self-assessed English: reading B2; listening and speaking B1; writing and interaction A2.</w:t>
       </w:r>
     </w:p>
     <w:sectPr>
@@ -694,15 +686,15 @@
     <w:pPr>
       <w:keepNext/>
       <w:keepLines/>
-      <w:spacing w:before="480" w:after="0"/>
+      <w:spacing w:before="200" w:after="60"/>
       <w:outlineLvl w:val="0"/>
     </w:pPr>
     <w:rPr>
-      <w:rFonts w:asciiTheme="majorHAnsi" w:eastAsiaTheme="majorEastAsia" w:hAnsiTheme="majorHAnsi" w:cstheme="majorBidi"/>
+      <w:rFonts w:asciiTheme="majorHAnsi" w:eastAsiaTheme="majorEastAsia" w:hAnsiTheme="majorHAnsi" w:cstheme="majorBidi" w:ascii="Liberation Sans" w:hAnsi="Liberation Sans"/>
       <w:b/>
       <w:bCs/>
-      <w:color w:val="365F91" w:themeColor="accent1" w:themeShade="BF"/>
-      <w:sz w:val="28"/>
+      <w:color w:val="000000"/>
+      <w:sz w:val="23"/>
       <w:szCs w:val="28"/>
     </w:rPr>
   </w:style>
@@ -718,15 +710,15 @@
     <w:pPr>
       <w:keepNext/>
       <w:keepLines/>
-      <w:spacing w:before="200" w:after="60"/>
+      <w:spacing w:before="200" w:after="0"/>
       <w:outlineLvl w:val="1"/>
     </w:pPr>
     <w:rPr>
-      <w:rFonts w:asciiTheme="majorHAnsi" w:eastAsiaTheme="majorEastAsia" w:hAnsiTheme="majorHAnsi" w:cstheme="majorBidi" w:ascii="Liberation Sans" w:hAnsi="Liberation Sans"/>
+      <w:rFonts w:asciiTheme="majorHAnsi" w:eastAsiaTheme="majorEastAsia" w:hAnsiTheme="majorHAnsi" w:cstheme="majorBidi"/>
       <w:b/>
       <w:bCs/>
-      <w:color w:val="133A66"/>
-      <w:sz w:val="23"/>
+      <w:color w:val="4F81BD" w:themeColor="accent1"/>
+      <w:sz w:val="26"/>
       <w:szCs w:val="26"/>
     </w:rPr>
   </w:style>
@@ -981,16 +973,13 @@
     <w:rsid w:val="00FC693F"/>
     <w:pPr>
       <w:keepNext/>
-      <w:pBdr>
-        <w:bottom w:val="single" w:sz="8" w:space="4" w:color="4F81BD" w:themeColor="accent1"/>
-      </w:pBdr>
       <w:spacing w:after="80" w:line="240" w:lineRule="auto" w:before="0"/>
       <w:contextualSpacing/>
     </w:pPr>
     <w:rPr>
       <w:rFonts w:asciiTheme="majorHAnsi" w:eastAsiaTheme="majorEastAsia" w:hAnsiTheme="majorHAnsi" w:cstheme="majorBidi" w:ascii="Liberation Sans" w:hAnsi="Liberation Sans"/>
       <w:b/>
-      <w:color w:val="133A66"/>
+      <w:color w:val="000000"/>
       <w:spacing w:val="5"/>
       <w:kern w:val="28"/>
       <w:sz w:val="39"/>
@@ -1469,9 +1458,6 @@
     <w:qFormat/>
     <w:rsid w:val="00FC693F"/>
     <w:pPr>
-      <w:pBdr>
-        <w:bottom w:val="single" w:sz="4" w:space="4" w:color="4F81BD" w:themeColor="accent1"/>
-      </w:pBdr>
       <w:spacing w:before="200" w:after="280"/>
       <w:ind w:left="936" w:right="936"/>
     </w:pPr>

</xml_diff>

<commit_message>
docs(resume): prepare one-page bilingual resumes for referrals
</commit_message>
<xml_diff>
--- a/Rodrigo_Pinheiro_2026_EN.docx
+++ b/Rodrigo_Pinheiro_2026_EN.docx
@@ -22,7 +22,7 @@
         <w:rPr>
           <w:b/>
         </w:rPr>
-        <w:t>Junior Back-End Developer | Python · Django · FastAPI · REST APIs</w:t>
+        <w:t>Junior Back-End Developer | Python · Django · REST APIs</w:t>
       </w:r>
     </w:p>
     <w:p>
@@ -45,20 +45,42 @@
           <w:t>rm20022101@gmail.com</w:t>
         </w:r>
       </w:hyperlink>
-      <w:r>
-        <w:rPr>
-          <w:b w:val="0"/>
-          <w:color w:val="53626D"/>
-          <w:sz w:val="16"/>
-        </w:rPr>
-        <w:t xml:space="preserve"> · </w:t>
-      </w:r>
+    </w:p>
+    <w:p>
       <w:hyperlink r:id="rId10">
         <w:r>
           <w:rPr>
             <w:color w:val="0E718B"/>
           </w:rPr>
-          <w:t>GitHub</w:t>
+          <w:t>Portfolio</w:t>
+        </w:r>
+      </w:hyperlink>
+      <w:r>
+        <w:rPr>
+          <w:b w:val="0"/>
+        </w:rPr>
+        <w:t xml:space="preserve"> · </w:t>
+      </w:r>
+      <w:hyperlink r:id="rId11">
+        <w:r>
+          <w:rPr>
+            <w:color w:val="0E718B"/>
+          </w:rPr>
+          <w:t>GitHub ZaraTakion</w:t>
+        </w:r>
+      </w:hyperlink>
+      <w:r>
+        <w:rPr>
+          <w:b w:val="0"/>
+        </w:rPr>
+        <w:t xml:space="preserve"> · </w:t>
+      </w:r>
+      <w:hyperlink r:id="rId12">
+        <w:r>
+          <w:rPr>
+            <w:color w:val="0E718B"/>
+          </w:rPr>
+          <w:t>LinkedIn</w:t>
         </w:r>
       </w:hyperlink>
     </w:p>
@@ -78,7 +100,7 @@
         <w:rPr>
           <w:b w:val="0"/>
         </w:rPr>
-        <w:t>Internet Systems graduate focused on Python back-end development. Academic and personal projects cover REST APIs, authentication and authorization, relational databases, automated testing, and React/Vite integration. Seeking an entry-level software engineering role.</w:t>
+        <w:t>Internet Systems Technology graduate focused on Python back-end development and seeking my first professional opportunity. I build personal and academic projects with REST APIs, JWT authentication, permissions, relational databases and automated tests. React and TypeScript complement my web application integration skills.</w:t>
       </w:r>
     </w:p>
     <w:p>
@@ -89,15 +111,49 @@
         <w:rPr>
           <w:b w:val="0"/>
         </w:rPr>
-        <w:t>Skills</w:t>
+        <w:t>Technical skills</w:t>
       </w:r>
     </w:p>
     <w:p>
       <w:r>
         <w:rPr>
+          <w:b/>
+        </w:rPr>
+        <w:t>Back end:</w:t>
+      </w:r>
+      <w:r>
+        <w:rPr>
           <w:b w:val="0"/>
         </w:rPr>
-        <w:t>Python, Django, Django REST Framework, FastAPI, Pydantic, JWT, SQL, SQLite, PostgreSQL (CI), Git, GitHub Actions, unittest, OpenAPI, Ruff, Docker Compose; complementary React, Vite, and JavaScript skills.</w:t>
+        <w:t xml:space="preserve"> Python, Django, Django REST Framework, FastAPI, Pydantic, REST APIs, JWT and OpenAPI.</w:t>
+      </w:r>
+    </w:p>
+    <w:p>
+      <w:r>
+        <w:rPr>
+          <w:b/>
+        </w:rPr>
+        <w:t>Data and quality:</w:t>
+      </w:r>
+      <w:r>
+        <w:rPr>
+          <w:b w:val="0"/>
+        </w:rPr>
+        <w:t xml:space="preserve"> SQL, PostgreSQL, SQLite, unittest, automated testing, Ruff, Git, GitHub Actions and Docker Compose.</w:t>
+      </w:r>
+    </w:p>
+    <w:p>
+      <w:r>
+        <w:rPr>
+          <w:b/>
+        </w:rPr>
+        <w:t>Complementary:</w:t>
+      </w:r>
+      <w:r>
+        <w:rPr>
+          <w:b w:val="0"/>
+        </w:rPr>
+        <w:t xml:space="preserve"> React, JavaScript, TypeScript, Vite, HTML and CSS.</w:t>
       </w:r>
     </w:p>
     <w:p>
@@ -108,7 +164,27 @@
         <w:rPr>
           <w:b w:val="0"/>
         </w:rPr>
-        <w:t>Projects</w:t>
+        <w:t>Personal and academic projects</w:t>
+      </w:r>
+    </w:p>
+    <w:p>
+      <w:pPr>
+        <w:spacing w:after="100"/>
+      </w:pPr>
+      <w:hyperlink r:id="rId13">
+        <w:r>
+          <w:rPr>
+            <w:color w:val="0E718B"/>
+            <w:b/>
+          </w:rPr>
+          <w:t>Support Tickets API</w:t>
+        </w:r>
+      </w:hyperlink>
+      <w:r>
+        <w:rPr>
+          <w:b/>
+        </w:rPr>
+        <w:t xml:space="preserve"> | Python · Django REST · JWT · PostgreSQL</w:t>
       </w:r>
     </w:p>
     <w:p>
@@ -121,26 +197,11 @@
         </w:rPr>
         <w:t xml:space="preserve">• </w:t>
       </w:r>
-      <w:hyperlink r:id="rId11">
-        <w:r>
-          <w:rPr>
-            <w:color w:val="0E718B"/>
-            <w:b/>
-          </w:rPr>
-          <w:t>Chamados API</w:t>
-        </w:r>
-      </w:hyperlink>
-      <w:r>
-        <w:rPr>
-          <w:b/>
-        </w:rPr>
-        <w:t>:</w:t>
-      </w:r>
       <w:r>
         <w:rPr>
           <w:b w:val="0"/>
         </w:rPr>
-        <w:t xml:space="preserve"> Django REST Framework support-ticket API with JWT, role-based access, auditing, notifications, and CI tests.</w:t>
+        <w:t>Support-ticket API with user and staff permissions, status transitions, internal comments and a persistent change history.</w:t>
       </w:r>
     </w:p>
     <w:p>
@@ -153,26 +214,31 @@
         </w:rPr>
         <w:t xml:space="preserve">• </w:t>
       </w:r>
-      <w:hyperlink r:id="rId12">
+      <w:r>
+        <w:rPr>
+          <w:b w:val="0"/>
+        </w:rPr>
+        <w:t>Transactional outbox notifications, OpenAPI documentation and tests for authentication, isolation and business rules. Local demo; CI also validates PostgreSQL and Redis/Celery.</w:t>
+      </w:r>
+    </w:p>
+    <w:p>
+      <w:pPr>
+        <w:spacing w:after="100"/>
+      </w:pPr>
+      <w:hyperlink r:id="rId14">
         <w:r>
           <w:rPr>
             <w:color w:val="0E718B"/>
             <w:b/>
           </w:rPr>
-          <w:t>Task Manager API</w:t>
+          <w:t>Takion Campus</w:t>
         </w:r>
       </w:hyperlink>
       <w:r>
         <w:rPr>
           <w:b/>
         </w:rPr>
-        <w:t>:</w:t>
-      </w:r>
-      <w:r>
-        <w:rPr>
-          <w:b w:val="0"/>
-        </w:rPr>
-        <w:t xml:space="preserve"> FastAPI CRUD with SQLite persistence, validation and tests; modernization merged via PR #2.</w:t>
+        <w:t xml:space="preserve"> | Django REST · React · Vite · PostgreSQL</w:t>
       </w:r>
     </w:p>
     <w:p>
@@ -185,26 +251,82 @@
         </w:rPr>
         <w:t xml:space="preserve">• </w:t>
       </w:r>
-      <w:hyperlink r:id="rId13">
+      <w:r>
+        <w:rPr>
+          <w:b w:val="0"/>
+        </w:rPr>
+        <w:t>Independent academic platform, evolved from UPA Portal Acadêmico, with student, teacher and administration workflows.</w:t>
+      </w:r>
+    </w:p>
+    <w:p>
+      <w:pPr>
+        <w:ind w:left="144" w:hanging="144"/>
+      </w:pPr>
+      <w:r>
+        <w:rPr>
+          <w:color w:val="0E718B"/>
+        </w:rPr>
+        <w:t xml:space="preserve">• </w:t>
+      </w:r>
+      <w:r>
+        <w:rPr>
+          <w:b w:val="0"/>
+        </w:rPr>
+        <w:t>Front-end and API integration, role-based access, courses, grades, attendance and authorized file access; back-end and front-end tests and CI checks.</w:t>
+      </w:r>
+    </w:p>
+    <w:p>
+      <w:pPr>
+        <w:spacing w:after="100"/>
+      </w:pPr>
+      <w:hyperlink r:id="rId15">
         <w:r>
           <w:rPr>
             <w:color w:val="0E718B"/>
             <w:b/>
           </w:rPr>
-          <w:t>UPA Academic Portal</w:t>
+          <w:t>Biya Parallel Worlds</w:t>
         </w:r>
       </w:hyperlink>
       <w:r>
         <w:rPr>
           <w:b/>
         </w:rPr>
-        <w:t>:</w:t>
+        <w:t xml:space="preserve"> | React · TypeScript · Vite</w:t>
+      </w:r>
+    </w:p>
+    <w:p>
+      <w:pPr>
+        <w:ind w:left="144" w:hanging="144"/>
+      </w:pPr>
+      <w:r>
+        <w:rPr>
+          <w:color w:val="0E718B"/>
+        </w:rPr>
+        <w:t xml:space="preserve">• </w:t>
       </w:r>
       <w:r>
         <w:rPr>
           <w:b w:val="0"/>
         </w:rPr>
-        <w:t xml:space="preserve"> Django REST Framework and React/Vite application with academic modules, role-based workflows and tests.</w:t>
+        <w:t>Bilingual PT/EN interface with Crystal and Ghost visual modes, interactive gallery, keyboard navigation and reduced-motion support.</w:t>
+      </w:r>
+    </w:p>
+    <w:p>
+      <w:pPr>
+        <w:ind w:left="144" w:hanging="144"/>
+      </w:pPr>
+      <w:r>
+        <w:rPr>
+          <w:color w:val="0E718B"/>
+        </w:rPr>
+        <w:t xml:space="preserve">• </w:t>
+      </w:r>
+      <w:r>
+        <w:rPr>
+          <w:b w:val="0"/>
+        </w:rPr>
+        <w:t>React and TypeScript components, Cloudflare Workers publishing and automated type checks, tests and builds.</w:t>
       </w:r>
     </w:p>
     <w:p>
@@ -221,21 +343,15 @@
     <w:p>
       <w:r>
         <w:rPr>
-          <w:b w:val="0"/>
-        </w:rPr>
-        <w:t xml:space="preserve">Technology Degree in Internet Systems — Centro Universitário UNIESP. </w:t>
-      </w:r>
-      <w:r>
-        <w:rPr>
           <w:b/>
         </w:rPr>
-        <w:t>Reported</w:t>
+        <w:t>Technology Degree in Internet Systems</w:t>
       </w:r>
       <w:r>
         <w:rPr>
           <w:b w:val="0"/>
         </w:rPr>
-        <w:t xml:space="preserve"> completion: 2026.</w:t>
+        <w:t xml:space="preserve"> · Centro Universitário UNIESP · Completed in 2026.</w:t>
       </w:r>
     </w:p>
     <w:p>
@@ -254,11 +370,11 @@
         <w:rPr>
           <w:b w:val="0"/>
         </w:rPr>
-        <w:t>Portuguese native. English (self-reported): reading B2, listening/speaking B1, writing and interaction A2.</w:t>
+        <w:t>Portuguese native · Basic English · Intermediate Spanish.</w:t>
       </w:r>
     </w:p>
     <w:sectPr>
-      <w:pgSz w:w="12240" w:h="15840"/>
+      <w:pgSz w:w="11906" w:h="16838"/>
       <w:pgMar w:top="893" w:right="1051" w:bottom="864" w:left="1051" w:header="346" w:footer="432" w:gutter="0"/>
       <w:cols w:space="720"/>
       <w:docGrid w:linePitch="360"/>
@@ -631,7 +747,7 @@
     <w:qFormat/>
     <w:rsid w:val="00FC693F"/>
     <w:pPr>
-      <w:spacing w:line="283" w:lineRule="auto" w:after="80"/>
+      <w:spacing w:line="269" w:lineRule="auto" w:after="80"/>
     </w:pPr>
     <w:rPr>
       <w:rFonts w:ascii="Liberation Sans" w:hAnsi="Liberation Sans"/>
@@ -718,14 +834,14 @@
     <w:pPr>
       <w:keepNext/>
       <w:keepLines/>
-      <w:spacing w:before="200" w:after="60"/>
+      <w:spacing w:before="180" w:after="60"/>
       <w:outlineLvl w:val="1"/>
     </w:pPr>
     <w:rPr>
       <w:rFonts w:asciiTheme="majorHAnsi" w:eastAsiaTheme="majorEastAsia" w:hAnsiTheme="majorHAnsi" w:cstheme="majorBidi" w:ascii="Liberation Sans" w:hAnsi="Liberation Sans"/>
       <w:b/>
       <w:bCs/>
-      <w:color w:val="133A66"/>
+      <w:color w:val="000000"/>
       <w:sz w:val="23"/>
       <w:szCs w:val="26"/>
     </w:rPr>
@@ -981,16 +1097,13 @@
     <w:rsid w:val="00FC693F"/>
     <w:pPr>
       <w:keepNext/>
-      <w:pBdr>
-        <w:bottom w:val="single" w:sz="8" w:space="4" w:color="4F81BD" w:themeColor="accent1"/>
-      </w:pBdr>
       <w:spacing w:after="80" w:line="240" w:lineRule="auto" w:before="0"/>
       <w:contextualSpacing/>
     </w:pPr>
     <w:rPr>
       <w:rFonts w:asciiTheme="majorHAnsi" w:eastAsiaTheme="majorEastAsia" w:hAnsiTheme="majorHAnsi" w:cstheme="majorBidi" w:ascii="Liberation Sans" w:hAnsi="Liberation Sans"/>
       <w:b/>
-      <w:color w:val="133A66"/>
+      <w:color w:val="000000"/>
       <w:spacing w:val="5"/>
       <w:kern w:val="28"/>
       <w:sz w:val="39"/>
@@ -1469,9 +1582,6 @@
     <w:qFormat/>
     <w:rsid w:val="00FC693F"/>
     <w:pPr>
-      <w:pBdr>
-        <w:bottom w:val="single" w:sz="4" w:space="4" w:color="4F81BD" w:themeColor="accent1"/>
-      </w:pBdr>
       <w:spacing w:before="200" w:after="280"/>
       <w:ind w:left="936" w:right="936"/>
     </w:pPr>

</xml_diff>

<commit_message>
docs: publicar currículos PT/EN para indicação profissional
</commit_message>
<xml_diff>
--- a/Rodrigo_Pinheiro_2026_EN.docx
+++ b/Rodrigo_Pinheiro_2026_EN.docx
@@ -22,7 +22,7 @@
         <w:rPr>
           <w:b/>
         </w:rPr>
-        <w:t>Junior Back-End Developer | Python · Django · FastAPI · REST APIs</w:t>
+        <w:t>Junior Back-End Developer | Python · Django · REST APIs</w:t>
       </w:r>
     </w:p>
     <w:p>
@@ -45,20 +45,42 @@
           <w:t>rm20022101@gmail.com</w:t>
         </w:r>
       </w:hyperlink>
-      <w:r>
-        <w:rPr>
-          <w:b w:val="0"/>
-          <w:color w:val="53626D"/>
-          <w:sz w:val="16"/>
-        </w:rPr>
-        <w:t xml:space="preserve"> · </w:t>
-      </w:r>
+    </w:p>
+    <w:p>
       <w:hyperlink r:id="rId10">
         <w:r>
           <w:rPr>
             <w:color w:val="0E718B"/>
           </w:rPr>
-          <w:t>GitHub</w:t>
+          <w:t>Portfolio</w:t>
+        </w:r>
+      </w:hyperlink>
+      <w:r>
+        <w:rPr>
+          <w:b w:val="0"/>
+        </w:rPr>
+        <w:t xml:space="preserve"> · </w:t>
+      </w:r>
+      <w:hyperlink r:id="rId11">
+        <w:r>
+          <w:rPr>
+            <w:color w:val="0E718B"/>
+          </w:rPr>
+          <w:t>GitHub ZaraTakion</w:t>
+        </w:r>
+      </w:hyperlink>
+      <w:r>
+        <w:rPr>
+          <w:b w:val="0"/>
+        </w:rPr>
+        <w:t xml:space="preserve"> · </w:t>
+      </w:r>
+      <w:hyperlink r:id="rId12">
+        <w:r>
+          <w:rPr>
+            <w:color w:val="0E718B"/>
+          </w:rPr>
+          <w:t>LinkedIn</w:t>
         </w:r>
       </w:hyperlink>
     </w:p>
@@ -78,7 +100,7 @@
         <w:rPr>
           <w:b w:val="0"/>
         </w:rPr>
-        <w:t>Internet Systems graduate focused on Python back-end development. Academic and personal projects cover REST APIs, authentication and authorization, relational databases, automated testing, and React/Vite integration. Seeking an entry-level software engineering role.</w:t>
+        <w:t>Internet Systems Technology graduate focused on Python back-end development and seeking my first professional opportunity. I build personal and academic projects with REST APIs, JWT authentication, permissions, relational databases and automated tests. React and TypeScript complement my web application integration skills.</w:t>
       </w:r>
     </w:p>
     <w:p>
@@ -89,15 +111,49 @@
         <w:rPr>
           <w:b w:val="0"/>
         </w:rPr>
-        <w:t>Skills</w:t>
+        <w:t>Technical skills</w:t>
       </w:r>
     </w:p>
     <w:p>
       <w:r>
         <w:rPr>
+          <w:b/>
+        </w:rPr>
+        <w:t>Back end:</w:t>
+      </w:r>
+      <w:r>
+        <w:rPr>
           <w:b w:val="0"/>
         </w:rPr>
-        <w:t>Python, Django, Django REST Framework, FastAPI, Pydantic, JWT, SQL, SQLite, PostgreSQL (CI), Git, GitHub Actions, unittest, OpenAPI, Ruff, Docker Compose; complementary React, Vite, and JavaScript skills.</w:t>
+        <w:t xml:space="preserve"> Python, Django, Django REST Framework, FastAPI, Pydantic, REST APIs, JWT and OpenAPI.</w:t>
+      </w:r>
+    </w:p>
+    <w:p>
+      <w:r>
+        <w:rPr>
+          <w:b/>
+        </w:rPr>
+        <w:t>Data and quality:</w:t>
+      </w:r>
+      <w:r>
+        <w:rPr>
+          <w:b w:val="0"/>
+        </w:rPr>
+        <w:t xml:space="preserve"> SQL, PostgreSQL, SQLite, unittest, automated testing, Ruff, Git, GitHub Actions and Docker Compose.</w:t>
+      </w:r>
+    </w:p>
+    <w:p>
+      <w:r>
+        <w:rPr>
+          <w:b/>
+        </w:rPr>
+        <w:t>Complementary:</w:t>
+      </w:r>
+      <w:r>
+        <w:rPr>
+          <w:b w:val="0"/>
+        </w:rPr>
+        <w:t xml:space="preserve"> React, JavaScript, TypeScript, Vite, HTML and CSS.</w:t>
       </w:r>
     </w:p>
     <w:p>
@@ -108,7 +164,27 @@
         <w:rPr>
           <w:b w:val="0"/>
         </w:rPr>
-        <w:t>Projects</w:t>
+        <w:t>Personal and academic projects</w:t>
+      </w:r>
+    </w:p>
+    <w:p>
+      <w:pPr>
+        <w:spacing w:after="100"/>
+      </w:pPr>
+      <w:hyperlink r:id="rId13">
+        <w:r>
+          <w:rPr>
+            <w:color w:val="0E718B"/>
+            <w:b/>
+          </w:rPr>
+          <w:t>Support Tickets API</w:t>
+        </w:r>
+      </w:hyperlink>
+      <w:r>
+        <w:rPr>
+          <w:b/>
+        </w:rPr>
+        <w:t xml:space="preserve"> | Python · Django REST · JWT · PostgreSQL</w:t>
       </w:r>
     </w:p>
     <w:p>
@@ -121,26 +197,11 @@
         </w:rPr>
         <w:t xml:space="preserve">• </w:t>
       </w:r>
-      <w:hyperlink r:id="rId11">
-        <w:r>
-          <w:rPr>
-            <w:color w:val="0E718B"/>
-            <w:b/>
-          </w:rPr>
-          <w:t>Chamados API</w:t>
-        </w:r>
-      </w:hyperlink>
-      <w:r>
-        <w:rPr>
-          <w:b/>
-        </w:rPr>
-        <w:t>:</w:t>
-      </w:r>
       <w:r>
         <w:rPr>
           <w:b w:val="0"/>
         </w:rPr>
-        <w:t xml:space="preserve"> Django REST Framework support-ticket API with JWT, role-based access, auditing, notifications, and CI tests.</w:t>
+        <w:t>Support-ticket API with user and staff permissions, status transitions, internal comments and a persistent change history.</w:t>
       </w:r>
     </w:p>
     <w:p>
@@ -153,26 +214,31 @@
         </w:rPr>
         <w:t xml:space="preserve">• </w:t>
       </w:r>
-      <w:hyperlink r:id="rId12">
+      <w:r>
+        <w:rPr>
+          <w:b w:val="0"/>
+        </w:rPr>
+        <w:t>Transactional outbox notifications, OpenAPI documentation and tests for authentication, isolation and business rules. Local demo; CI also validates PostgreSQL and Redis/Celery.</w:t>
+      </w:r>
+    </w:p>
+    <w:p>
+      <w:pPr>
+        <w:spacing w:after="100"/>
+      </w:pPr>
+      <w:hyperlink r:id="rId14">
         <w:r>
           <w:rPr>
             <w:color w:val="0E718B"/>
             <w:b/>
           </w:rPr>
-          <w:t>Task Manager API</w:t>
+          <w:t>Takion Campus</w:t>
         </w:r>
       </w:hyperlink>
       <w:r>
         <w:rPr>
           <w:b/>
         </w:rPr>
-        <w:t>:</w:t>
-      </w:r>
-      <w:r>
-        <w:rPr>
-          <w:b w:val="0"/>
-        </w:rPr>
-        <w:t xml:space="preserve"> FastAPI CRUD with SQLite persistence, validation and tests; modernization merged via PR #2.</w:t>
+        <w:t xml:space="preserve"> | Django REST · React · Vite · PostgreSQL</w:t>
       </w:r>
     </w:p>
     <w:p>
@@ -185,26 +251,82 @@
         </w:rPr>
         <w:t xml:space="preserve">• </w:t>
       </w:r>
-      <w:hyperlink r:id="rId13">
+      <w:r>
+        <w:rPr>
+          <w:b w:val="0"/>
+        </w:rPr>
+        <w:t>Independent academic platform, evolved from UPA Portal Acadêmico, with student, teacher and administration workflows.</w:t>
+      </w:r>
+    </w:p>
+    <w:p>
+      <w:pPr>
+        <w:ind w:left="144" w:hanging="144"/>
+      </w:pPr>
+      <w:r>
+        <w:rPr>
+          <w:color w:val="0E718B"/>
+        </w:rPr>
+        <w:t xml:space="preserve">• </w:t>
+      </w:r>
+      <w:r>
+        <w:rPr>
+          <w:b w:val="0"/>
+        </w:rPr>
+        <w:t>Front-end and API integration, role-based access, courses, grades, attendance and authorized file access; back-end and front-end tests and CI checks.</w:t>
+      </w:r>
+    </w:p>
+    <w:p>
+      <w:pPr>
+        <w:spacing w:after="100"/>
+      </w:pPr>
+      <w:hyperlink r:id="rId15">
         <w:r>
           <w:rPr>
             <w:color w:val="0E718B"/>
             <w:b/>
           </w:rPr>
-          <w:t>UPA Academic Portal</w:t>
+          <w:t>Biya Parallel Worlds</w:t>
         </w:r>
       </w:hyperlink>
       <w:r>
         <w:rPr>
           <w:b/>
         </w:rPr>
-        <w:t>:</w:t>
+        <w:t xml:space="preserve"> | React · TypeScript · Vite</w:t>
+      </w:r>
+    </w:p>
+    <w:p>
+      <w:pPr>
+        <w:ind w:left="144" w:hanging="144"/>
+      </w:pPr>
+      <w:r>
+        <w:rPr>
+          <w:color w:val="0E718B"/>
+        </w:rPr>
+        <w:t xml:space="preserve">• </w:t>
       </w:r>
       <w:r>
         <w:rPr>
           <w:b w:val="0"/>
         </w:rPr>
-        <w:t xml:space="preserve"> Django REST Framework and React/Vite application with academic modules, role-based workflows and tests.</w:t>
+        <w:t>Bilingual PT/EN interface with Crystal and Ghost visual modes, interactive gallery, keyboard navigation and reduced-motion support.</w:t>
+      </w:r>
+    </w:p>
+    <w:p>
+      <w:pPr>
+        <w:ind w:left="144" w:hanging="144"/>
+      </w:pPr>
+      <w:r>
+        <w:rPr>
+          <w:color w:val="0E718B"/>
+        </w:rPr>
+        <w:t xml:space="preserve">• </w:t>
+      </w:r>
+      <w:r>
+        <w:rPr>
+          <w:b w:val="0"/>
+        </w:rPr>
+        <w:t>React and TypeScript components, Cloudflare Workers publishing and automated type checks, tests and builds.</w:t>
       </w:r>
     </w:p>
     <w:p>
@@ -221,21 +343,15 @@
     <w:p>
       <w:r>
         <w:rPr>
-          <w:b w:val="0"/>
-        </w:rPr>
-        <w:t xml:space="preserve">Technology Degree in Internet Systems — Centro Universitário UNIESP. </w:t>
-      </w:r>
-      <w:r>
-        <w:rPr>
           <w:b/>
         </w:rPr>
-        <w:t>Reported</w:t>
+        <w:t>Technology Degree in Internet Systems</w:t>
       </w:r>
       <w:r>
         <w:rPr>
           <w:b w:val="0"/>
         </w:rPr>
-        <w:t xml:space="preserve"> completion: 2026.</w:t>
+        <w:t xml:space="preserve"> · Centro Universitário UNIESP · Completed in 2026.</w:t>
       </w:r>
     </w:p>
     <w:p>
@@ -254,11 +370,11 @@
         <w:rPr>
           <w:b w:val="0"/>
         </w:rPr>
-        <w:t>Portuguese native. English (self-reported): reading B2, listening/speaking B1, writing and interaction A2.</w:t>
+        <w:t>Portuguese native · Basic English · Intermediate Spanish.</w:t>
       </w:r>
     </w:p>
     <w:sectPr>
-      <w:pgSz w:w="12240" w:h="15840"/>
+      <w:pgSz w:w="11906" w:h="16838"/>
       <w:pgMar w:top="893" w:right="1051" w:bottom="864" w:left="1051" w:header="346" w:footer="432" w:gutter="0"/>
       <w:cols w:space="720"/>
       <w:docGrid w:linePitch="360"/>
@@ -631,7 +747,7 @@
     <w:qFormat/>
     <w:rsid w:val="00FC693F"/>
     <w:pPr>
-      <w:spacing w:line="283" w:lineRule="auto" w:after="80"/>
+      <w:spacing w:line="269" w:lineRule="auto" w:after="80"/>
     </w:pPr>
     <w:rPr>
       <w:rFonts w:ascii="Liberation Sans" w:hAnsi="Liberation Sans"/>
@@ -718,14 +834,14 @@
     <w:pPr>
       <w:keepNext/>
       <w:keepLines/>
-      <w:spacing w:before="200" w:after="60"/>
+      <w:spacing w:before="180" w:after="60"/>
       <w:outlineLvl w:val="1"/>
     </w:pPr>
     <w:rPr>
       <w:rFonts w:asciiTheme="majorHAnsi" w:eastAsiaTheme="majorEastAsia" w:hAnsiTheme="majorHAnsi" w:cstheme="majorBidi" w:ascii="Liberation Sans" w:hAnsi="Liberation Sans"/>
       <w:b/>
       <w:bCs/>
-      <w:color w:val="133A66"/>
+      <w:color w:val="000000"/>
       <w:sz w:val="23"/>
       <w:szCs w:val="26"/>
     </w:rPr>
@@ -981,16 +1097,13 @@
     <w:rsid w:val="00FC693F"/>
     <w:pPr>
       <w:keepNext/>
-      <w:pBdr>
-        <w:bottom w:val="single" w:sz="8" w:space="4" w:color="4F81BD" w:themeColor="accent1"/>
-      </w:pBdr>
       <w:spacing w:after="80" w:line="240" w:lineRule="auto" w:before="0"/>
       <w:contextualSpacing/>
     </w:pPr>
     <w:rPr>
       <w:rFonts w:asciiTheme="majorHAnsi" w:eastAsiaTheme="majorEastAsia" w:hAnsiTheme="majorHAnsi" w:cstheme="majorBidi" w:ascii="Liberation Sans" w:hAnsi="Liberation Sans"/>
       <w:b/>
-      <w:color w:val="133A66"/>
+      <w:color w:val="000000"/>
       <w:spacing w:val="5"/>
       <w:kern w:val="28"/>
       <w:sz w:val="39"/>
@@ -1469,9 +1582,6 @@
     <w:qFormat/>
     <w:rsid w:val="00FC693F"/>
     <w:pPr>
-      <w:pBdr>
-        <w:bottom w:val="single" w:sz="4" w:space="4" w:color="4F81BD" w:themeColor="accent1"/>
-      </w:pBdr>
       <w:spacing w:before="200" w:after="280"/>
       <w:ind w:left="936" w:right="936"/>
     </w:pPr>

</xml_diff>